<commit_message>
Update preprocessing and cyclone diagnostics
</commit_message>
<xml_diff>
--- a/TC_PVBG/doc/PV_Budget_Equations.docx
+++ b/TC_PVBG/doc/PV_Budget_Equations.docx
@@ -31,10 +31,7 @@
     </w:p>
     <w:p>
       <w:r>
-        <w:rPr>
-          <w:rFonts w:ascii="Calibri" w:hAnsi="Calibri" w:eastAsia="Calibri"/>
-        </w:rPr>
-        <w:t>This document describes the Ertel potential-vorticity (PV) definitions, budget equation, output variables, sign convention, and residual interpretation used by the TC_PVBG toolbox. The notation follows the current MATLAB implementation in TC_PVBG_mvct.m and TC_PVBG_calculate.m.</w:t>
+        <w:t>This document describes the Ertel potential-vorticity (PV) definitions, budget equation, output variables, sign convention, and residual interpretation used by the TC_PVBG toolbox. The notation follows the current MATLAB implementation in TC_PVBG_mvct.m and TC_PVBG_calculate.m; the PV definition and nonconservative source form follow References 1 and 2.</w:t>
       </w:r>
     </w:p>
     <w:p>
@@ -203,10 +200,7 @@
     </w:p>
     <w:p>
       <w:r>
-        <w:rPr>
-          <w:rFonts w:ascii="Calibri" w:hAnsi="Calibri" w:eastAsia="Calibri"/>
-        </w:rPr>
-        <w:t>The absolute-vorticity vector is:</w:t>
+        <w:t>The full absolute-vorticity vector eta_a = zeta + 2 Omega is used. In the local east-north-up cylindrical basis, with phi = 0 eastward and positive phi counter-clockwise:</w:t>
       </w:r>
     </w:p>
     <w:p>
@@ -215,10 +209,7 @@
         <w:shd w:fill="F4F6F9"/>
       </w:pPr>
       <w:r>
-        <w:rPr>
-          <w:rFonts w:ascii="Calibri" w:hAnsi="Calibri" w:eastAsia="Calibri"/>
-        </w:rPr>
-        <w:t>zeta_r   = (1/r)dw/dphi - dv/dz</w:t>
+        <w:t>eta_r   = (1/r)dw/dphi - dv/dz + 2 Omega cos(latitude) sin(phi)</w:t>
       </w:r>
     </w:p>
     <w:p>
@@ -227,10 +218,7 @@
         <w:shd w:fill="F4F6F9"/>
       </w:pPr>
       <w:r>
-        <w:rPr>
-          <w:rFonts w:ascii="Calibri" w:hAnsi="Calibri" w:eastAsia="Calibri"/>
-        </w:rPr>
-        <w:t>zeta_phi = du/dz - dw/dr</w:t>
+        <w:t>eta_phi = du/dz - dw/dr + 2 Omega cos(latitude) cos(phi)</w:t>
       </w:r>
     </w:p>
     <w:p>
@@ -239,18 +227,12 @@
         <w:shd w:fill="F4F6F9"/>
       </w:pPr>
       <w:r>
-        <w:rPr>
-          <w:rFonts w:ascii="Calibri" w:hAnsi="Calibri" w:eastAsia="Calibri"/>
-        </w:rPr>
-        <w:t>zeta_z   = avo</w:t>
+        <w:t>eta_z   = avo = zeta_z + 2 Omega sin(latitude)</w:t>
       </w:r>
     </w:p>
     <w:p>
       <w:r>
-        <w:rPr>
-          <w:rFonts w:ascii="Calibri" w:hAnsi="Calibri" w:eastAsia="Calibri"/>
-        </w:rPr>
-        <w:t>Here avo is the preprocessed absolute vertical vorticity. Therefore:</w:t>
+        <w:t>Here zeta denotes relative vorticity, Omega is the Earth rotation rate, and avo is WRF's preprocessed vertical absolute vorticity. The horizontal planetary components are diagnosed from the local latitude and azimuth; no extra planetary correction must be applied to avo. Therefore:</w:t>
       </w:r>
     </w:p>
     <w:p>
@@ -259,10 +241,7 @@
         <w:shd w:fill="F4F6F9"/>
       </w:pPr>
       <w:r>
-        <w:rPr>
-          <w:rFonts w:ascii="Calibri" w:hAnsi="Calibri" w:eastAsia="Calibri"/>
-        </w:rPr>
-        <w:t>PV_b = (zeta_r*b_r + zeta_phi*b_phi + zeta_z*b_z) / rho</w:t>
+        <w:t>PV_b = (eta_r*b_r + eta_phi*b_phi + eta_z*b_z) / rho</w:t>
       </w:r>
     </w:p>
     <w:p>
@@ -1705,6 +1684,21 @@
         <w:t>This document is aligned with the current TC_PVBG MATLAB outputs: PV_tendency, PV_radial_adv, PV_azimuth_adv, PV_vertical_adv, PV_solenoidal, PV_therm, PV_friction_pbl, PV_friction_khkv, PV_friction, PV_sum, and PV_residual.</w:t>
       </w:r>
     </w:p>
+    <w:p>
+      <w:r>
+        <w:t>11. References</w:t>
+      </w:r>
+    </w:p>
+    <w:p>
+      <w:r>
+        <w:t>1. Ertel, H., 1942: Ein neuer hydrodynamischer Wirbelsatz. Meteorologische Zeitschrift, 59, 271-281.</w:t>
+      </w:r>
+    </w:p>
+    <w:p>
+      <w:r>
+        <w:t>2. Haynes, P. H., and M. E. McIntyre, 1987: On the evolution of vorticity and potential vorticity in the presence of diabatic heating and frictional or other forces. Journal of the Atmospheric Sciences, 44, 828-841. https://doi.org/10.1175/1520-0469(1987)044&lt;0828:OTEOVA&gt;2.0.CO;2.</w:t>
+      </w:r>
+    </w:p>
     <w:sectPr>
       <w:headerReference w:type="default" r:id="rId9"/>
       <w:footerReference w:type="default" r:id="rId10"/>

</xml_diff>